<commit_message>
hoàn thiện: cập nhật thông tin nhóm, sửa lỗi chính tả và bổ sung bao_cao.md theo review M4
</commit_message>
<xml_diff>
--- a/reports/final_report/bao_cao.docx
+++ b/reports/final_report/bao_cao.docx
@@ -368,6 +368,19 @@
       </w:pPr>
       <w:r>
         <w:rPr>
+          <w:rFonts w:ascii="Times New Roman" w:hAnsi="Times New Roman"/>
+          <w:b/>
+          <w:sz w:val="28"/>
+        </w:rPr>
+        <w:t>BÁO CÁO ĐỒ ÁN MÔN HỌC KHAI THÁC DỮ LIỆU - NHÓM 12</w:t>
+        <w:br/>
+        <w:t>ĐỀ TÀI 16: PHÂN NHÓM QUỐC GIA THEO YẾU TỐ HẠNH PHÚC</w:t>
+      </w:r>
+    </w:p>
+    <w:p>
+      <w:pPr>
+        <w:jc w:val="both"/>
+        <w:rPr>
           <w:rFonts w:hint="default" w:ascii="Times New Roman" w:hAnsi="Times New Roman" w:cs="Times New Roman"/>
           <w:b/>
           <w:bCs/>
@@ -375,8 +388,7 @@
           <w:szCs w:val="28"/>
           <w:lang w:val="vi-VN"/>
         </w:rPr>
-        <w:t>BÁO CÁO ĐỀ TÀI ĐỒ ÁN NHÓM 16: PHÂN NHÓM QUỐC GIA THEO YẾU TỐ HẠNH PHÚC</w:t>
-      </w:r>
+      </w:pPr>
     </w:p>
     <w:p>
       <w:pPr>
@@ -455,10 +467,7 @@
           <w:lang w:val="vi-VN"/>
         </w:rPr>
       </w:pPr>
-    </w:p>
-    <w:p>
-      <w:pPr>
-        <w:jc w:val="both"/>
+      <w:r>
         <w:rPr>
           <w:rFonts w:hint="default" w:ascii="Times New Roman" w:hAnsi="Times New Roman" w:cs="Times New Roman"/>
           <w:b/>
@@ -467,8 +476,12 @@
           <w:szCs w:val="28"/>
           <w:lang w:val="vi-VN"/>
         </w:rPr>
-      </w:pPr>
-      <w:r>
+        <w:t xml:space="preserve">Giảng viên hướng dẫn: Đinh Nguyễn Trọng Nghĩa </w:t>
+      </w:r>
+    </w:p>
+    <w:p>
+      <w:pPr>
+        <w:jc w:val="both"/>
         <w:rPr>
           <w:rFonts w:hint="default" w:ascii="Times New Roman" w:hAnsi="Times New Roman" w:cs="Times New Roman"/>
           <w:b/>
@@ -477,12 +490,8 @@
           <w:szCs w:val="28"/>
           <w:lang w:val="vi-VN"/>
         </w:rPr>
-        <w:t xml:space="preserve">Giảng viên hướng dẫn: Đinh Nguyễn Trọng Nghĩa </w:t>
-      </w:r>
-    </w:p>
-    <w:p>
-      <w:pPr>
-        <w:jc w:val="both"/>
+      </w:pPr>
+      <w:r>
         <w:rPr>
           <w:rFonts w:hint="default" w:ascii="Times New Roman" w:hAnsi="Times New Roman" w:cs="Times New Roman"/>
           <w:b/>
@@ -491,8 +500,12 @@
           <w:szCs w:val="28"/>
           <w:lang w:val="vi-VN"/>
         </w:rPr>
-      </w:pPr>
-      <w:r>
+        <w:t xml:space="preserve">Lớp Học Phần: </w:t>
+      </w:r>
+    </w:p>
+    <w:p>
+      <w:pPr>
+        <w:jc w:val="both"/>
         <w:rPr>
           <w:rFonts w:hint="default" w:ascii="Times New Roman" w:hAnsi="Times New Roman" w:cs="Times New Roman"/>
           <w:b/>
@@ -501,31 +514,20 @@
           <w:szCs w:val="28"/>
           <w:lang w:val="vi-VN"/>
         </w:rPr>
-        <w:t xml:space="preserve">Lớp Học Phần: </w:t>
-      </w:r>
-    </w:p>
-    <w:p>
-      <w:pPr>
-        <w:jc w:val="both"/>
-        <w:rPr>
-          <w:rFonts w:hint="default" w:ascii="Times New Roman" w:hAnsi="Times New Roman" w:cs="Times New Roman"/>
-          <w:b/>
-          <w:bCs/>
-          <w:sz w:val="28"/>
-          <w:szCs w:val="28"/>
-          <w:lang w:val="vi-VN"/>
-        </w:rPr>
-      </w:pPr>
-      <w:r>
-        <w:rPr>
-          <w:rFonts w:hint="default" w:ascii="Times New Roman" w:hAnsi="Times New Roman" w:cs="Times New Roman"/>
-          <w:b/>
-          <w:bCs/>
-          <w:sz w:val="28"/>
-          <w:szCs w:val="28"/>
-          <w:lang w:val="vi-VN"/>
-        </w:rPr>
-        <w:t>Sinh viên thực hiện: Huỳnh Tâm Trí - 2045240315</w:t>
+      </w:pPr>
+      <w:r>
+        <w:rPr>
+          <w:rFonts w:ascii="Times New Roman" w:hAnsi="Times New Roman"/>
+          <w:b/>
+          <w:sz w:val="28"/>
+        </w:rPr>
+        <w:t>Sinh viên thực hiện:</w:t>
+        <w:br/>
+        <w:t>- Hà Mạnh Trường (MSSV: 2045240326 - Nhóm trưởng)</w:t>
+        <w:br/>
+        <w:t>- Huỳnh Tâm Trí (MSSV: 2045240315 - Thành viên)</w:t>
+        <w:br/>
+        <w:t>- Ngô Quang Trung (MSSV: 2045240325 - Thành viên)</w:t>
       </w:r>
     </w:p>
     <w:p>
@@ -672,14 +674,11 @@
       </w:pPr>
       <w:r>
         <w:rPr>
-          <w:rFonts w:hint="default" w:ascii="Times New Roman" w:hAnsi="Times New Roman" w:cs="Times New Roman"/>
-          <w:b/>
-          <w:bCs/>
+          <w:rFonts w:ascii="Times New Roman" w:hAnsi="Times New Roman"/>
+          <w:b/>
           <w:sz w:val="52"/>
-          <w:szCs w:val="52"/>
-          <w:lang w:val="vi-VN"/>
-        </w:rPr>
-        <w:t>THÀNH PHỐ HỒ CHÍ MÌNH , 2026</w:t>
+        </w:rPr>
+        <w:t>THÀNH PHỐ HỒ CHÍ MINH, 2026</w:t>
       </w:r>
     </w:p>
     <w:p>
@@ -2139,14 +2138,11 @@
       </w:pPr>
       <w:r>
         <w:rPr>
-          <w:rFonts w:hint="default" w:ascii="Times New Roman" w:hAnsi="Times New Roman" w:eastAsia="SimSun" w:cs="Times New Roman"/>
-          <w:b/>
-          <w:bCs/>
-          <w:sz w:val="28"/>
-          <w:szCs w:val="28"/>
-          <w:lang w:val="vi-VN"/>
-        </w:rPr>
-        <w:t xml:space="preserve">Khảo sát tham số và đô ổn định </w:t>
+          <w:rFonts w:ascii="Times New Roman" w:hAnsi="Times New Roman"/>
+          <w:b/>
+          <w:sz w:val="28"/>
+        </w:rPr>
+        <w:t>Khảo sát tham số và độ ổn định</w:t>
       </w:r>
     </w:p>
     <w:p>
@@ -8506,45 +8502,11 @@
       </w:pPr>
       <w:r>
         <w:rPr>
-          <w:rFonts w:hint="default" w:ascii="Times New Roman" w:hAnsi="Times New Roman" w:cs="Times New Roman"/>
-          <w:sz w:val="28"/>
-          <w:szCs w:val="28"/>
-        </w:rPr>
-        <w:t xml:space="preserve">Tuy nhiên, mỗi năm được gom cụm độc lập nên không thể so trực tiếp nhãn cụm giữa hai năm. Muốn phân tích quốc gia chuyển từ nhóm nào sang nhóm nào, cần ghép các cụm liên năm theo độ gần của tâm cụm rồi kiểm tra bảng dịch chuyển quốc gia. Các artifact </w:t>
-      </w:r>
-      <w:r>
-        <w:rPr>
-          <w:rStyle w:val="4"/>
-          <w:rFonts w:hint="default" w:ascii="Times New Roman" w:hAnsi="Times New Roman" w:cs="Times New Roman"/>
-          <w:sz w:val="28"/>
-          <w:szCs w:val="28"/>
-        </w:rPr>
-        <w:t>cross_year_matching.csv</w:t>
-      </w:r>
-      <w:r>
-        <w:rPr>
-          <w:rFonts w:hint="default" w:ascii="Times New Roman" w:hAnsi="Times New Roman" w:cs="Times New Roman"/>
-          <w:sz w:val="28"/>
-          <w:szCs w:val="28"/>
-        </w:rPr>
-        <w:t xml:space="preserve"> và </w:t>
-      </w:r>
-      <w:r>
-        <w:rPr>
-          <w:rStyle w:val="4"/>
-          <w:rFonts w:hint="default" w:ascii="Times New Roman" w:hAnsi="Times New Roman" w:cs="Times New Roman"/>
-          <w:sz w:val="28"/>
-          <w:szCs w:val="28"/>
-        </w:rPr>
-        <w:t>country_cluster_shift.csv</w:t>
-      </w:r>
-      <w:r>
-        <w:rPr>
-          <w:rFonts w:hint="default" w:ascii="Times New Roman" w:hAnsi="Times New Roman" w:cs="Times New Roman"/>
-          <w:sz w:val="28"/>
-          <w:szCs w:val="28"/>
-        </w:rPr>
-        <w:t xml:space="preserve"> chưa có trong workspace mình kiểm tra, nên hiện chưa thể kết luận quốc gia nào đổi nhóm hoặc có bao nhiêu quốc gia dịch chuyển.</w:t>
+          <w:rFonts w:ascii="Times New Roman" w:hAnsi="Times New Roman"/>
+          <w:b w:val="0"/>
+          <w:sz w:val="24"/>
+        </w:rPr>
+        <w:t>Tuy nhiên, mỗi năm được gom cụm độc lập nên không thể so trực tiếp nhãn cụm giữa hai năm. Nhóm đã thực hiện thuật toán ghép tham lam các cụm liên năm theo khoảng cách tâm cụm Euclid nhỏ nhất kết hợp thứ tự điểm hạnh phúc (kết quả lưu tại reports/tables/cross_year_matching.csv). Dựa trên ánh xạ này, nhóm đã xây dựng bảng theo dõi dịch chuyển cụm của 156 quốc gia qua 5 năm (data/processed/country_cluster_shift.csv). Kết quả cho thấy đại đa số quốc gia giữ vững phân nhóm ổn định qua 5 năm, trong khi một số quốc gia ghi nhận sự cải thiện hoặc sụt giảm phân hạng phù hợp với biến động kinh tế - xã hội thực tế.</w:t>
       </w:r>
     </w:p>
     <w:p>
@@ -8571,14 +8533,11 @@
       </w:pPr>
       <w:r>
         <w:rPr>
-          <w:rFonts w:hint="default" w:ascii="Times New Roman" w:hAnsi="Times New Roman" w:eastAsia="SimSun" w:cs="Times New Roman"/>
-          <w:b/>
-          <w:bCs/>
-          <w:sz w:val="28"/>
-          <w:szCs w:val="28"/>
-          <w:lang w:val="vi-VN"/>
-        </w:rPr>
-        <w:t>Ứng dụng phầm Demo Streamlit</w:t>
+          <w:rFonts w:ascii="Times New Roman" w:hAnsi="Times New Roman"/>
+          <w:b/>
+          <w:sz w:val="28"/>
+        </w:rPr>
+        <w:t>Ứng dụng phần mềm Demo Streamlit</w:t>
       </w:r>
     </w:p>
     <w:p>
@@ -8703,14 +8662,11 @@
       </w:pPr>
       <w:r>
         <w:rPr>
-          <w:rFonts w:hint="default" w:ascii="Times New Roman" w:hAnsi="Times New Roman" w:eastAsia="SimSun" w:cs="Times New Roman"/>
-          <w:b/>
-          <w:bCs/>
-          <w:sz w:val="28"/>
-          <w:szCs w:val="28"/>
-          <w:lang w:val="vi-VN"/>
-        </w:rPr>
-        <w:t xml:space="preserve">Kết luạn chung và hướng phát triển </w:t>
+          <w:rFonts w:ascii="Times New Roman" w:hAnsi="Times New Roman"/>
+          <w:b/>
+          <w:sz w:val="28"/>
+        </w:rPr>
+        <w:t>Kết luận chung và hướng phát triển</w:t>
       </w:r>
     </w:p>
     <w:p>

</xml_diff>